<commit_message>
docs(georgetown): rename project "Type" field to "Funding" for clarity
"Type" was ambiguous (read as who-runs-it); the field is about funding/scope
(Club / District Grant / Global Grant / Joint), distinct from Champion (who
led it). Renamed the header on all 6 year tabs of the Service Projects sheet
and across the form templates (master, Word sources, drafts) and regenerated
both .docx files. DB column remains `type`; field map notes the mapping.

Co-Authored-By: Claude Opus 4.8 (1M context) <noreply@anthropic.com>
</commit_message>
<xml_diff>
--- a/apps/georgetown/docs/templates/RC-Georgetown-Project-Summary-Form.docx
+++ b/apps/georgetown/docs/templates/RC-Georgetown-Project-Summary-Form.docx
@@ -382,13 +382,13 @@
           <w:b/>
           <w:bCs/>
         </w:rPr>
-        <w:t xml:space="preserve">Type</w:t>
+        <w:t xml:space="preserve">Funding</w:t>
       </w:r>
       <w:r>
         <w:t xml:space="preserve"> </w:t>
       </w:r>
       <w:r>
-        <w:t xml:space="preserve">— how was it run / funded?</w:t>
+        <w:t xml:space="preserve">— how was the project funded?</w:t>
       </w:r>
     </w:p>
     <w:p>

</xml_diff>